<commit_message>
My final Code, independent investigation and Revised Summary
</commit_message>
<xml_diff>
--- a/Summary Practical Application 1.docx
+++ b/Summary Practical Application 1.docx
@@ -524,7 +524,7 @@
     </w:p>
     <w:p>
       <w:pPr>
-        <w:spacing w:before="100" w:beforeAutospacing="1" w:after="100" w:afterAutospacing="1"/>
+        <w:spacing w:after="0"/>
         <w:outlineLvl w:val="2"/>
         <w:rPr>
           <w:rFonts w:ascii="Times New Roman" w:hAnsi="Times New Roman" w:cs="Times New Roman"/>
@@ -547,7 +547,7 @@
           <w:ilvl w:val="0"/>
           <w:numId w:val="3"/>
         </w:numPr>
-        <w:spacing w:before="100" w:beforeAutospacing="1" w:after="100" w:afterAutospacing="1" w:line="240" w:lineRule="auto"/>
+        <w:spacing w:after="0" w:line="240" w:lineRule="auto"/>
         <w:rPr>
           <w:rFonts w:ascii="Times New Roman" w:hAnsi="Times New Roman" w:cs="Times New Roman"/>
         </w:rPr>
@@ -575,7 +575,7 @@
     </w:p>
     <w:p>
       <w:pPr>
-        <w:spacing w:before="100" w:beforeAutospacing="1" w:after="100" w:afterAutospacing="1"/>
+        <w:spacing w:after="0"/>
         <w:outlineLvl w:val="2"/>
         <w:rPr>
           <w:rFonts w:ascii="Times New Roman" w:hAnsi="Times New Roman" w:cs="Times New Roman"/>
@@ -598,7 +598,7 @@
           <w:ilvl w:val="0"/>
           <w:numId w:val="4"/>
         </w:numPr>
-        <w:spacing w:before="100" w:beforeAutospacing="1" w:after="100" w:afterAutospacing="1" w:line="240" w:lineRule="auto"/>
+        <w:spacing w:after="0" w:line="240" w:lineRule="auto"/>
         <w:rPr>
           <w:rFonts w:ascii="Times New Roman" w:hAnsi="Times New Roman" w:cs="Times New Roman"/>
         </w:rPr>
@@ -630,7 +630,7 @@
           <w:ilvl w:val="1"/>
           <w:numId w:val="11"/>
         </w:numPr>
-        <w:spacing w:before="100" w:beforeAutospacing="1" w:after="100" w:afterAutospacing="1" w:line="240" w:lineRule="auto"/>
+        <w:spacing w:after="0" w:line="240" w:lineRule="auto"/>
         <w:rPr>
           <w:rFonts w:ascii="Times New Roman" w:hAnsi="Times New Roman" w:cs="Times New Roman"/>
         </w:rPr>
@@ -656,7 +656,7 @@
           <w:ilvl w:val="0"/>
           <w:numId w:val="4"/>
         </w:numPr>
-        <w:spacing w:before="100" w:beforeAutospacing="1" w:after="100" w:afterAutospacing="1" w:line="240" w:lineRule="auto"/>
+        <w:spacing w:after="0" w:line="240" w:lineRule="auto"/>
         <w:rPr>
           <w:rFonts w:ascii="Times New Roman" w:hAnsi="Times New Roman" w:cs="Times New Roman"/>
         </w:rPr>
@@ -688,7 +688,7 @@
           <w:ilvl w:val="1"/>
           <w:numId w:val="12"/>
         </w:numPr>
-        <w:spacing w:before="100" w:beforeAutospacing="1" w:after="100" w:afterAutospacing="1" w:line="240" w:lineRule="auto"/>
+        <w:spacing w:after="0" w:line="240" w:lineRule="auto"/>
         <w:rPr>
           <w:rFonts w:ascii="Times New Roman" w:hAnsi="Times New Roman" w:cs="Times New Roman"/>
         </w:rPr>
@@ -710,7 +710,7 @@
     </w:p>
     <w:p>
       <w:pPr>
-        <w:spacing w:before="100" w:beforeAutospacing="1" w:after="100" w:afterAutospacing="1"/>
+        <w:spacing w:after="0"/>
         <w:rPr>
           <w:rFonts w:ascii="Times New Roman" w:hAnsi="Times New Roman" w:cs="Times New Roman"/>
         </w:rPr>
@@ -738,7 +738,7 @@
     </w:p>
     <w:p>
       <w:pPr>
-        <w:spacing w:before="100" w:beforeAutospacing="1" w:after="100" w:afterAutospacing="1"/>
+        <w:spacing w:after="0"/>
         <w:outlineLvl w:val="2"/>
         <w:rPr>
           <w:rFonts w:ascii="Times New Roman" w:hAnsi="Times New Roman" w:cs="Times New Roman"/>
@@ -757,7 +757,7 @@
     </w:p>
     <w:p>
       <w:pPr>
-        <w:spacing w:before="100" w:beforeAutospacing="1" w:after="100" w:afterAutospacing="1" w:line="240" w:lineRule="auto"/>
+        <w:spacing w:after="0" w:line="240" w:lineRule="auto"/>
         <w:rPr>
           <w:rFonts w:ascii="Times New Roman" w:hAnsi="Times New Roman" w:cs="Times New Roman"/>
         </w:rPr>
@@ -775,7 +775,7 @@
           <w:ilvl w:val="1"/>
           <w:numId w:val="13"/>
         </w:numPr>
-        <w:spacing w:before="100" w:beforeAutospacing="1" w:after="100" w:afterAutospacing="1" w:line="240" w:lineRule="auto"/>
+        <w:spacing w:after="0" w:line="240" w:lineRule="auto"/>
         <w:rPr>
           <w:rFonts w:ascii="Times New Roman" w:hAnsi="Times New Roman" w:cs="Times New Roman"/>
         </w:rPr>
@@ -793,7 +793,7 @@
           <w:ilvl w:val="1"/>
           <w:numId w:val="13"/>
         </w:numPr>
-        <w:spacing w:before="100" w:beforeAutospacing="1" w:after="100" w:afterAutospacing="1" w:line="240" w:lineRule="auto"/>
+        <w:spacing w:after="0" w:line="240" w:lineRule="auto"/>
         <w:rPr>
           <w:rFonts w:ascii="Times New Roman" w:hAnsi="Times New Roman" w:cs="Times New Roman"/>
         </w:rPr>
@@ -841,35 +841,21 @@
     </w:p>
     <w:p>
       <w:pPr>
-        <w:spacing w:before="100" w:beforeAutospacing="1" w:after="100" w:afterAutospacing="1"/>
-        <w:rPr>
-          <w:rFonts w:ascii="Times New Roman" w:hAnsi="Times New Roman" w:cs="Times New Roman"/>
-        </w:rPr>
-      </w:pPr>
-      <w:r>
-        <w:rPr>
-          <w:rFonts w:ascii="Times New Roman" w:hAnsi="Times New Roman" w:cs="Times New Roman"/>
-        </w:rPr>
-        <w:t xml:space="preserve">Indicates that </w:t>
-      </w:r>
-      <w:r>
-        <w:rPr>
-          <w:rFonts w:ascii="Times New Roman" w:hAnsi="Times New Roman" w:cs="Times New Roman"/>
-          <w:b/>
-          <w:bCs/>
-        </w:rPr>
-        <w:t>mature drivers with moderate bar habits are more responsive</w:t>
-      </w:r>
-      <w:r>
-        <w:rPr>
-          <w:rFonts w:ascii="Times New Roman" w:hAnsi="Times New Roman" w:cs="Times New Roman"/>
-        </w:rPr>
-        <w:t>.</w:t>
-      </w:r>
-    </w:p>
-    <w:p>
-      <w:pPr>
-        <w:spacing w:before="100" w:beforeAutospacing="1" w:after="100" w:afterAutospacing="1"/>
+        <w:spacing w:after="0"/>
+        <w:rPr>
+          <w:rFonts w:ascii="Times New Roman" w:hAnsi="Times New Roman" w:cs="Times New Roman"/>
+        </w:rPr>
+      </w:pPr>
+      <w:r>
+        <w:rPr>
+          <w:rFonts w:ascii="Times New Roman" w:hAnsi="Times New Roman" w:cs="Times New Roman"/>
+        </w:rPr>
+        <w:t>Indicates that mature drivers with moderate bar habits are more responsive.</w:t>
+      </w:r>
+    </w:p>
+    <w:p>
+      <w:pPr>
+        <w:spacing w:after="0"/>
         <w:outlineLvl w:val="2"/>
         <w:rPr>
           <w:rFonts w:ascii="Times New Roman" w:hAnsi="Times New Roman" w:cs="Times New Roman"/>
@@ -883,12 +869,28 @@
           <w:b/>
           <w:bCs/>
         </w:rPr>
-        <w:t>2.6 Combined Behavioral and Demographic Factors</w:t>
-      </w:r>
-    </w:p>
-    <w:p>
-      <w:pPr>
-        <w:spacing w:before="100" w:beforeAutospacing="1" w:after="100" w:afterAutospacing="1" w:line="240" w:lineRule="auto"/>
+        <w:t xml:space="preserve">2.6 Combined Behavioral and </w:t>
+      </w:r>
+      <w:r>
+        <w:rPr>
+          <w:rFonts w:ascii="Times New Roman" w:hAnsi="Times New Roman" w:cs="Times New Roman"/>
+          <w:b/>
+          <w:bCs/>
+        </w:rPr>
+        <w:t>other f</w:t>
+      </w:r>
+      <w:r>
+        <w:rPr>
+          <w:rFonts w:ascii="Times New Roman" w:hAnsi="Times New Roman" w:cs="Times New Roman"/>
+          <w:b/>
+          <w:bCs/>
+        </w:rPr>
+        <w:t>actors</w:t>
+      </w:r>
+    </w:p>
+    <w:p>
+      <w:pPr>
+        <w:spacing w:after="0" w:line="240" w:lineRule="auto"/>
         <w:rPr>
           <w:rFonts w:ascii="Times New Roman" w:hAnsi="Times New Roman" w:cs="Times New Roman"/>
         </w:rPr>
@@ -906,7 +908,7 @@
           <w:ilvl w:val="0"/>
           <w:numId w:val="14"/>
         </w:numPr>
-        <w:spacing w:before="100" w:beforeAutospacing="1" w:after="100" w:afterAutospacing="1" w:line="240" w:lineRule="auto"/>
+        <w:spacing w:after="0" w:line="240" w:lineRule="auto"/>
         <w:rPr>
           <w:rFonts w:ascii="Times New Roman" w:hAnsi="Times New Roman" w:cs="Times New Roman"/>
         </w:rPr>
@@ -924,7 +926,7 @@
           <w:ilvl w:val="0"/>
           <w:numId w:val="14"/>
         </w:numPr>
-        <w:spacing w:before="100" w:beforeAutospacing="1" w:after="100" w:afterAutospacing="1" w:line="240" w:lineRule="auto"/>
+        <w:spacing w:after="0" w:line="240" w:lineRule="auto"/>
         <w:rPr>
           <w:rFonts w:ascii="Times New Roman" w:hAnsi="Times New Roman" w:cs="Times New Roman"/>
         </w:rPr>
@@ -950,7 +952,7 @@
           <w:ilvl w:val="0"/>
           <w:numId w:val="14"/>
         </w:numPr>
-        <w:spacing w:before="100" w:beforeAutospacing="1" w:after="100" w:afterAutospacing="1" w:line="240" w:lineRule="auto"/>
+        <w:spacing w:after="0" w:line="240" w:lineRule="auto"/>
         <w:rPr>
           <w:rFonts w:ascii="Times New Roman" w:hAnsi="Times New Roman" w:cs="Times New Roman"/>
         </w:rPr>
@@ -998,7 +1000,7 @@
     </w:p>
     <w:p>
       <w:pPr>
-        <w:spacing w:before="100" w:beforeAutospacing="1" w:after="100" w:afterAutospacing="1"/>
+        <w:spacing w:after="0"/>
         <w:rPr>
           <w:rFonts w:ascii="Times New Roman" w:hAnsi="Times New Roman" w:cs="Times New Roman"/>
         </w:rPr>
@@ -1023,10 +1025,24 @@
         </w:rPr>
         <w:t>, indicating a strong target segment</w:t>
       </w:r>
-    </w:p>
-    <w:p>
-      <w:pPr>
-        <w:spacing w:before="100" w:beforeAutospacing="1" w:after="100" w:afterAutospacing="1"/>
+      <w:r>
+        <w:rPr>
+          <w:rFonts w:ascii="Times New Roman" w:hAnsi="Times New Roman" w:cs="Times New Roman"/>
+        </w:rPr>
+        <w:t>.</w:t>
+      </w:r>
+    </w:p>
+    <w:p>
+      <w:pPr>
+        <w:spacing w:after="0"/>
+        <w:rPr>
+          <w:rFonts w:ascii="Times New Roman" w:hAnsi="Times New Roman" w:cs="Times New Roman"/>
+        </w:rPr>
+      </w:pPr>
+    </w:p>
+    <w:p>
+      <w:pPr>
+        <w:spacing w:after="0"/>
         <w:outlineLvl w:val="2"/>
         <w:rPr>
           <w:rFonts w:ascii="Times New Roman" w:hAnsi="Times New Roman" w:cs="Times New Roman"/>
@@ -1049,7 +1065,7 @@
           <w:ilvl w:val="0"/>
           <w:numId w:val="7"/>
         </w:numPr>
-        <w:spacing w:before="100" w:beforeAutospacing="1" w:after="100" w:afterAutospacing="1" w:line="240" w:lineRule="auto"/>
+        <w:spacing w:after="0" w:line="240" w:lineRule="auto"/>
         <w:rPr>
           <w:rFonts w:ascii="Times New Roman" w:hAnsi="Times New Roman" w:cs="Times New Roman"/>
         </w:rPr>
@@ -1089,7 +1105,7 @@
           <w:ilvl w:val="0"/>
           <w:numId w:val="7"/>
         </w:numPr>
-        <w:spacing w:before="100" w:beforeAutospacing="1" w:after="100" w:afterAutospacing="1" w:line="240" w:lineRule="auto"/>
+        <w:spacing w:after="0" w:line="240" w:lineRule="auto"/>
         <w:rPr>
           <w:rFonts w:ascii="Times New Roman" w:hAnsi="Times New Roman" w:cs="Times New Roman"/>
         </w:rPr>
@@ -1111,7 +1127,7 @@
     </w:p>
     <w:p>
       <w:pPr>
-        <w:spacing w:before="100" w:beforeAutospacing="1" w:after="100" w:afterAutospacing="1"/>
+        <w:spacing w:after="0"/>
         <w:rPr>
           <w:rFonts w:ascii="Times New Roman" w:hAnsi="Times New Roman" w:cs="Times New Roman"/>
         </w:rPr>
@@ -1153,7 +1169,6 @@
           <w:b/>
           <w:bCs/>
         </w:rPr>
-        <w:lastRenderedPageBreak/>
         <w:t>2.8 Comparative Segment Analysis</w:t>
       </w:r>
     </w:p>
@@ -1350,7 +1365,7 @@
           <w:ilvl w:val="0"/>
           <w:numId w:val="8"/>
         </w:numPr>
-        <w:spacing w:before="100" w:beforeAutospacing="1" w:after="100" w:afterAutospacing="1" w:line="240" w:lineRule="auto"/>
+        <w:spacing w:after="0" w:line="240" w:lineRule="auto"/>
         <w:rPr>
           <w:rFonts w:ascii="Times New Roman" w:hAnsi="Times New Roman" w:cs="Times New Roman"/>
         </w:rPr>
@@ -1376,7 +1391,7 @@
           <w:ilvl w:val="0"/>
           <w:numId w:val="9"/>
         </w:numPr>
-        <w:spacing w:before="100" w:beforeAutospacing="1" w:after="100" w:afterAutospacing="1" w:line="240" w:lineRule="auto"/>
+        <w:spacing w:line="240" w:lineRule="auto"/>
         <w:rPr>
           <w:rFonts w:ascii="Times New Roman" w:hAnsi="Times New Roman" w:cs="Times New Roman"/>
         </w:rPr>
@@ -1394,7 +1409,7 @@
           <w:ilvl w:val="0"/>
           <w:numId w:val="9"/>
         </w:numPr>
-        <w:spacing w:before="100" w:beforeAutospacing="1" w:after="100" w:afterAutospacing="1" w:line="240" w:lineRule="auto"/>
+        <w:spacing w:line="240" w:lineRule="auto"/>
         <w:rPr>
           <w:rFonts w:ascii="Times New Roman" w:hAnsi="Times New Roman" w:cs="Times New Roman"/>
         </w:rPr>
@@ -1412,7 +1427,7 @@
           <w:ilvl w:val="0"/>
           <w:numId w:val="9"/>
         </w:numPr>
-        <w:spacing w:before="100" w:beforeAutospacing="1" w:after="100" w:afterAutospacing="1" w:line="240" w:lineRule="auto"/>
+        <w:spacing w:line="240" w:lineRule="auto"/>
         <w:rPr>
           <w:rFonts w:ascii="Times New Roman" w:hAnsi="Times New Roman" w:cs="Times New Roman"/>
         </w:rPr>
@@ -1430,7 +1445,7 @@
           <w:ilvl w:val="0"/>
           <w:numId w:val="9"/>
         </w:numPr>
-        <w:spacing w:before="100" w:beforeAutospacing="1" w:after="100" w:afterAutospacing="1" w:line="240" w:lineRule="auto"/>
+        <w:spacing w:line="240" w:lineRule="auto"/>
         <w:rPr>
           <w:rFonts w:ascii="Times New Roman" w:hAnsi="Times New Roman" w:cs="Times New Roman"/>
         </w:rPr>
@@ -1448,7 +1463,7 @@
           <w:ilvl w:val="0"/>
           <w:numId w:val="9"/>
         </w:numPr>
-        <w:spacing w:before="100" w:beforeAutospacing="1" w:after="100" w:afterAutospacing="1" w:line="240" w:lineRule="auto"/>
+        <w:spacing w:line="240" w:lineRule="auto"/>
         <w:rPr>
           <w:rFonts w:ascii="Times New Roman" w:hAnsi="Times New Roman" w:cs="Times New Roman"/>
         </w:rPr>
@@ -1466,7 +1481,7 @@
           <w:ilvl w:val="0"/>
           <w:numId w:val="9"/>
         </w:numPr>
-        <w:spacing w:before="100" w:beforeAutospacing="1" w:after="100" w:afterAutospacing="1" w:line="240" w:lineRule="auto"/>
+        <w:spacing w:line="240" w:lineRule="auto"/>
         <w:rPr>
           <w:rFonts w:ascii="Times New Roman" w:hAnsi="Times New Roman" w:cs="Times New Roman"/>
         </w:rPr>
@@ -1480,17 +1495,41 @@
     </w:p>
     <w:p>
       <w:pPr>
-        <w:spacing w:before="100" w:beforeAutospacing="1" w:after="100" w:afterAutospacing="1"/>
+        <w:spacing w:after="0"/>
         <w:jc w:val="both"/>
         <w:rPr>
           <w:rFonts w:ascii="Times New Roman" w:hAnsi="Times New Roman" w:cs="Times New Roman"/>
         </w:rPr>
       </w:pPr>
-      <w:r>
-        <w:rPr>
-          <w:rFonts w:ascii="Times New Roman" w:hAnsi="Times New Roman" w:cs="Times New Roman"/>
-        </w:rPr>
-        <w:t>Drivers who are moderately social (occasional bar visitors), over the age of 25, and not constrained by family responsibilities (e.g., no children passengers) are the most likely to accept bar coupons. Additionally, favorable environmental conditions and lower-cost options further increase acceptance rates, while frequent bar-goers and lower-income segments show reduced responsiveness.</w:t>
+    </w:p>
+    <w:p>
+      <w:pPr>
+        <w:spacing w:after="0"/>
+        <w:jc w:val="both"/>
+        <w:rPr>
+          <w:rFonts w:ascii="Times New Roman" w:hAnsi="Times New Roman" w:cs="Times New Roman"/>
+        </w:rPr>
+      </w:pPr>
+      <w:r>
+        <w:rPr>
+          <w:rFonts w:ascii="Times New Roman" w:hAnsi="Times New Roman" w:cs="Times New Roman"/>
+        </w:rPr>
+        <w:t xml:space="preserve">Drivers who are moderately social (occasional bar visitors), over the age of 25, and not constrained </w:t>
+      </w:r>
+    </w:p>
+    <w:p>
+      <w:pPr>
+        <w:spacing w:after="0"/>
+        <w:jc w:val="both"/>
+        <w:rPr>
+          <w:rFonts w:ascii="Times New Roman" w:hAnsi="Times New Roman" w:cs="Times New Roman"/>
+        </w:rPr>
+      </w:pPr>
+      <w:r>
+        <w:rPr>
+          <w:rFonts w:ascii="Times New Roman" w:hAnsi="Times New Roman" w:cs="Times New Roman"/>
+        </w:rPr>
+        <w:t>by family responsibilities (e.g., no children passengers) are the most likely to accept bar coupons. Additionally, favorable environmental conditions and lower-cost options further increase acceptance rates, while frequent bar-goers and lower-income segments show reduced responsiveness.</w:t>
       </w:r>
       <w:r>
         <w:rPr>
@@ -1501,7 +1540,7 @@
     </w:p>
     <w:p>
       <w:pPr>
-        <w:spacing w:before="100" w:beforeAutospacing="1" w:after="100" w:afterAutospacing="1"/>
+        <w:spacing w:after="0"/>
         <w:jc w:val="both"/>
         <w:rPr>
           <w:rFonts w:ascii="Times New Roman" w:hAnsi="Times New Roman" w:cs="Times New Roman"/>
@@ -1537,10 +1576,285 @@
     </w:p>
     <w:p>
       <w:pPr>
-        <w:rPr>
-          <w:rFonts w:ascii="Times New Roman" w:hAnsi="Times New Roman" w:cs="Times New Roman"/>
-        </w:rPr>
-      </w:pPr>
+        <w:jc w:val="center"/>
+        <w:rPr>
+          <w:rFonts w:ascii="Times New Roman" w:hAnsi="Times New Roman" w:cs="Times New Roman"/>
+          <w:b/>
+          <w:bCs/>
+        </w:rPr>
+      </w:pPr>
+      <w:r>
+        <w:rPr>
+          <w:rFonts w:ascii="Times New Roman" w:hAnsi="Times New Roman" w:cs="Times New Roman"/>
+          <w:b/>
+          <w:bCs/>
+        </w:rPr>
+        <w:t>Recommendations:</w:t>
+      </w:r>
+    </w:p>
+    <w:p>
+      <w:pPr>
+        <w:pStyle w:val="NormalWeb"/>
+        <w:spacing w:before="0" w:beforeAutospacing="0" w:after="0" w:afterAutospacing="0" w:line="360" w:lineRule="auto"/>
+      </w:pPr>
+      <w:r>
+        <w:t>Based on the observed patterns in coupon acceptance behavior, the following recommendations are proposed:</w:t>
+      </w:r>
+    </w:p>
+    <w:p>
+      <w:pPr>
+        <w:pStyle w:val="NormalWeb"/>
+        <w:numPr>
+          <w:ilvl w:val="0"/>
+          <w:numId w:val="15"/>
+        </w:numPr>
+        <w:spacing w:before="0" w:beforeAutospacing="0" w:after="0" w:afterAutospacing="0" w:line="360" w:lineRule="auto"/>
+      </w:pPr>
+      <w:r>
+        <w:rPr>
+          <w:rStyle w:val="Strong"/>
+        </w:rPr>
+        <w:t>Target Frequent Bar Visitors:</w:t>
+      </w:r>
+      <w:r>
+        <w:br/>
+      </w:r>
+      <w:r>
+        <w:t xml:space="preserve">The acceptance rate is significantly higher (~62%) among drivers who visit bars </w:t>
+      </w:r>
+      <w:r>
+        <w:rPr>
+          <w:rStyle w:val="Strong"/>
+        </w:rPr>
+        <w:t>3 or fewer times per month</w:t>
+      </w:r>
+      <w:r>
+        <w:t xml:space="preserve"> compared to those who visit more frequently (~19%).This suggests that </w:t>
+      </w:r>
+      <w:r>
+        <w:rPr>
+          <w:rStyle w:val="Strong"/>
+        </w:rPr>
+        <w:t>moderate/occasional bar-goers are more responsive</w:t>
+      </w:r>
+      <w:r>
+        <w:t xml:space="preserve"> to bar coupons.</w:t>
+      </w:r>
+      <w:r>
+        <w:br/>
+      </w:r>
+      <w:r>
+        <w:rPr>
+          <w:rStyle w:val="Strong"/>
+        </w:rPr>
+        <w:t>Recommendation:</w:t>
+      </w:r>
+      <w:r>
+        <w:t xml:space="preserve"> Focus promotional efforts on this segment rather than frequent bar visitors.</w:t>
+      </w:r>
+    </w:p>
+    <w:p>
+      <w:pPr>
+        <w:pStyle w:val="NormalWeb"/>
+        <w:numPr>
+          <w:ilvl w:val="0"/>
+          <w:numId w:val="15"/>
+        </w:numPr>
+        <w:spacing w:before="0" w:beforeAutospacing="0" w:after="0" w:afterAutospacing="0" w:line="360" w:lineRule="auto"/>
+        <w:rPr>
+          <w:rStyle w:val="Strong"/>
+          <w:b w:val="0"/>
+          <w:bCs w:val="0"/>
+        </w:rPr>
+      </w:pPr>
+      <w:r>
+        <w:rPr>
+          <w:rStyle w:val="Strong"/>
+        </w:rPr>
+        <w:t>Optimize Temperature Conditions:</w:t>
+      </w:r>
+      <w:r>
+        <w:rPr>
+          <w:rStyle w:val="Strong"/>
+          <w:b w:val="0"/>
+          <w:bCs w:val="0"/>
+        </w:rPr>
+        <w:br/>
+        <w:t>Coupon acceptance is higher when the temperature is in the range of 75–80°F.</w:t>
+      </w:r>
+      <w:r>
+        <w:rPr>
+          <w:rStyle w:val="Strong"/>
+          <w:b w:val="0"/>
+          <w:bCs w:val="0"/>
+        </w:rPr>
+        <w:br/>
+      </w:r>
+      <w:r>
+        <w:rPr>
+          <w:rStyle w:val="Strong"/>
+        </w:rPr>
+        <w:t>Recommendation:</w:t>
+      </w:r>
+      <w:r>
+        <w:rPr>
+          <w:rStyle w:val="Strong"/>
+          <w:b w:val="0"/>
+          <w:bCs w:val="0"/>
+        </w:rPr>
+        <w:t xml:space="preserve"> Deploy location- and weather-aware campaigns to increase effectiveness.</w:t>
+      </w:r>
+    </w:p>
+    <w:p>
+      <w:pPr>
+        <w:pStyle w:val="NormalWeb"/>
+        <w:numPr>
+          <w:ilvl w:val="0"/>
+          <w:numId w:val="15"/>
+        </w:numPr>
+        <w:spacing w:before="0" w:beforeAutospacing="0" w:after="0" w:afterAutospacing="0" w:line="360" w:lineRule="auto"/>
+      </w:pPr>
+      <w:r>
+        <w:rPr>
+          <w:rStyle w:val="Strong"/>
+        </w:rPr>
+        <w:t>Prioritize High-Performing Coupon Categories</w:t>
+      </w:r>
+      <w:r>
+        <w:br/>
+        <w:t xml:space="preserve">Coffee house coupons show the highest acceptance, while </w:t>
+      </w:r>
+      <w:r>
+        <w:rPr>
+          <w:rStyle w:val="Strong"/>
+        </w:rPr>
+        <w:t>restaurant coupons ($20–50)</w:t>
+      </w:r>
+      <w:r>
+        <w:t xml:space="preserve"> have the lowest.</w:t>
+      </w:r>
+      <w:r>
+        <w:br/>
+      </w:r>
+      <w:r>
+        <w:rPr>
+          <w:rStyle w:val="Strong"/>
+        </w:rPr>
+        <w:t>Recommendation:</w:t>
+      </w:r>
+    </w:p>
+    <w:p>
+      <w:pPr>
+        <w:pStyle w:val="NormalWeb"/>
+        <w:numPr>
+          <w:ilvl w:val="0"/>
+          <w:numId w:val="16"/>
+        </w:numPr>
+        <w:spacing w:before="0" w:beforeAutospacing="0" w:after="0" w:afterAutospacing="0" w:line="360" w:lineRule="auto"/>
+      </w:pPr>
+      <w:r>
+        <w:t>Increase investment in high-performing categories (like coffee shops)</w:t>
+      </w:r>
+    </w:p>
+    <w:p>
+      <w:pPr>
+        <w:pStyle w:val="NormalWeb"/>
+        <w:numPr>
+          <w:ilvl w:val="0"/>
+          <w:numId w:val="16"/>
+        </w:numPr>
+        <w:spacing w:before="0" w:beforeAutospacing="0" w:after="0" w:afterAutospacing="0" w:line="360" w:lineRule="auto"/>
+      </w:pPr>
+      <w:r>
+        <w:t>Reevaluate pricing/value proposition of low-performing restaurant coupons</w:t>
+      </w:r>
+    </w:p>
+    <w:p>
+      <w:pPr>
+        <w:pStyle w:val="NormalWeb"/>
+        <w:numPr>
+          <w:ilvl w:val="0"/>
+          <w:numId w:val="15"/>
+        </w:numPr>
+        <w:spacing w:before="0" w:beforeAutospacing="0" w:after="0" w:afterAutospacing="0" w:line="360" w:lineRule="auto"/>
+      </w:pPr>
+      <w:r>
+        <w:rPr>
+          <w:rStyle w:val="Strong"/>
+        </w:rPr>
+        <w:t xml:space="preserve">Refine Customer Segmentation Strategy: </w:t>
+      </w:r>
+      <w:r>
+        <w:br/>
+        <w:t>Acceptance behavior varies significantly across user habits and context.</w:t>
+      </w:r>
+      <w:r>
+        <w:br/>
+      </w:r>
+      <w:r>
+        <w:rPr>
+          <w:rStyle w:val="Strong"/>
+        </w:rPr>
+        <w:t>Recommendation:</w:t>
+      </w:r>
+      <w:r>
+        <w:br/>
+        <w:t xml:space="preserve">Implement </w:t>
+      </w:r>
+      <w:r>
+        <w:rPr>
+          <w:rStyle w:val="Strong"/>
+        </w:rPr>
+        <w:t>behavioral segmentation models</w:t>
+      </w:r>
+      <w:r>
+        <w:t xml:space="preserve"> (like frequency of visits, lifestyle patterns) rather than broad targeting.</w:t>
+      </w:r>
+    </w:p>
+    <w:p>
+      <w:pPr>
+        <w:pStyle w:val="NormalWeb"/>
+        <w:numPr>
+          <w:ilvl w:val="0"/>
+          <w:numId w:val="15"/>
+        </w:numPr>
+        <w:spacing w:before="0" w:beforeAutospacing="0" w:after="0" w:afterAutospacing="0" w:line="360" w:lineRule="auto"/>
+      </w:pPr>
+      <w:r>
+        <w:rPr>
+          <w:rStyle w:val="Strong"/>
+        </w:rPr>
+        <w:lastRenderedPageBreak/>
+        <w:t>Data Quality Improvement</w:t>
+      </w:r>
+      <w:r>
+        <w:br/>
+        <w:t>Presence of duplicate entries (e.g., 7 duplicates found) may affect analysis accuracy.</w:t>
+      </w:r>
+      <w:r>
+        <w:br/>
+      </w:r>
+      <w:r>
+        <w:rPr>
+          <w:rStyle w:val="Strong"/>
+        </w:rPr>
+        <w:t>Recommendation:</w:t>
+      </w:r>
+      <w:r>
+        <w:t xml:space="preserve"> </w:t>
+      </w:r>
+      <w:r>
+        <w:t xml:space="preserve">Apply </w:t>
+      </w:r>
+      <w:r>
+        <w:rPr>
+          <w:rStyle w:val="Strong"/>
+        </w:rPr>
+        <w:t>data preprocessing and validation steps</w:t>
+      </w:r>
+      <w:r>
+        <w:t xml:space="preserve"> before analysis to ensure reliability.</w:t>
+      </w:r>
     </w:p>
     <w:p>
       <w:pPr>
@@ -2005,6 +2319,119 @@
     </w:lvl>
   </w:abstractNum>
   <w:abstractNum w:abstractNumId="3" w15:restartNumberingAfterBreak="0">
+    <w:nsid w:val="1B000DC5"/>
+    <w:multiLevelType w:val="hybridMultilevel"/>
+    <w:tmpl w:val="C1D8272C"/>
+    <w:lvl w:ilvl="0" w:tplc="04090001">
+      <w:start w:val="1"/>
+      <w:numFmt w:val="bullet"/>
+      <w:lvlText w:val=""/>
+      <w:lvlJc w:val="left"/>
+      <w:pPr>
+        <w:ind w:left="1800" w:hanging="360"/>
+      </w:pPr>
+      <w:rPr>
+        <w:rFonts w:ascii="Symbol" w:hAnsi="Symbol" w:hint="default"/>
+      </w:rPr>
+    </w:lvl>
+    <w:lvl w:ilvl="1" w:tplc="04090003" w:tentative="1">
+      <w:start w:val="1"/>
+      <w:numFmt w:val="bullet"/>
+      <w:lvlText w:val="o"/>
+      <w:lvlJc w:val="left"/>
+      <w:pPr>
+        <w:ind w:left="2520" w:hanging="360"/>
+      </w:pPr>
+      <w:rPr>
+        <w:rFonts w:ascii="Courier New" w:hAnsi="Courier New" w:cs="Courier New" w:hint="default"/>
+      </w:rPr>
+    </w:lvl>
+    <w:lvl w:ilvl="2" w:tplc="04090005" w:tentative="1">
+      <w:start w:val="1"/>
+      <w:numFmt w:val="bullet"/>
+      <w:lvlText w:val=""/>
+      <w:lvlJc w:val="left"/>
+      <w:pPr>
+        <w:ind w:left="3240" w:hanging="360"/>
+      </w:pPr>
+      <w:rPr>
+        <w:rFonts w:ascii="Wingdings" w:hAnsi="Wingdings" w:hint="default"/>
+      </w:rPr>
+    </w:lvl>
+    <w:lvl w:ilvl="3" w:tplc="04090001" w:tentative="1">
+      <w:start w:val="1"/>
+      <w:numFmt w:val="bullet"/>
+      <w:lvlText w:val=""/>
+      <w:lvlJc w:val="left"/>
+      <w:pPr>
+        <w:ind w:left="3960" w:hanging="360"/>
+      </w:pPr>
+      <w:rPr>
+        <w:rFonts w:ascii="Symbol" w:hAnsi="Symbol" w:hint="default"/>
+      </w:rPr>
+    </w:lvl>
+    <w:lvl w:ilvl="4" w:tplc="04090003" w:tentative="1">
+      <w:start w:val="1"/>
+      <w:numFmt w:val="bullet"/>
+      <w:lvlText w:val="o"/>
+      <w:lvlJc w:val="left"/>
+      <w:pPr>
+        <w:ind w:left="4680" w:hanging="360"/>
+      </w:pPr>
+      <w:rPr>
+        <w:rFonts w:ascii="Courier New" w:hAnsi="Courier New" w:cs="Courier New" w:hint="default"/>
+      </w:rPr>
+    </w:lvl>
+    <w:lvl w:ilvl="5" w:tplc="04090005" w:tentative="1">
+      <w:start w:val="1"/>
+      <w:numFmt w:val="bullet"/>
+      <w:lvlText w:val=""/>
+      <w:lvlJc w:val="left"/>
+      <w:pPr>
+        <w:ind w:left="5400" w:hanging="360"/>
+      </w:pPr>
+      <w:rPr>
+        <w:rFonts w:ascii="Wingdings" w:hAnsi="Wingdings" w:hint="default"/>
+      </w:rPr>
+    </w:lvl>
+    <w:lvl w:ilvl="6" w:tplc="04090001" w:tentative="1">
+      <w:start w:val="1"/>
+      <w:numFmt w:val="bullet"/>
+      <w:lvlText w:val=""/>
+      <w:lvlJc w:val="left"/>
+      <w:pPr>
+        <w:ind w:left="6120" w:hanging="360"/>
+      </w:pPr>
+      <w:rPr>
+        <w:rFonts w:ascii="Symbol" w:hAnsi="Symbol" w:hint="default"/>
+      </w:rPr>
+    </w:lvl>
+    <w:lvl w:ilvl="7" w:tplc="04090003" w:tentative="1">
+      <w:start w:val="1"/>
+      <w:numFmt w:val="bullet"/>
+      <w:lvlText w:val="o"/>
+      <w:lvlJc w:val="left"/>
+      <w:pPr>
+        <w:ind w:left="6840" w:hanging="360"/>
+      </w:pPr>
+      <w:rPr>
+        <w:rFonts w:ascii="Courier New" w:hAnsi="Courier New" w:cs="Courier New" w:hint="default"/>
+      </w:rPr>
+    </w:lvl>
+    <w:lvl w:ilvl="8" w:tplc="04090005" w:tentative="1">
+      <w:start w:val="1"/>
+      <w:numFmt w:val="bullet"/>
+      <w:lvlText w:val=""/>
+      <w:lvlJc w:val="left"/>
+      <w:pPr>
+        <w:ind w:left="7560" w:hanging="360"/>
+      </w:pPr>
+      <w:rPr>
+        <w:rFonts w:ascii="Wingdings" w:hAnsi="Wingdings" w:hint="default"/>
+      </w:rPr>
+    </w:lvl>
+  </w:abstractNum>
+  <w:abstractNum w:abstractNumId="4" w15:restartNumberingAfterBreak="0">
     <w:nsid w:val="36C267C5"/>
     <w:multiLevelType w:val="multilevel"/>
     <w:tmpl w:val="6BF059DE"/>
@@ -2153,7 +2580,7 @@
       </w:rPr>
     </w:lvl>
   </w:abstractNum>
-  <w:abstractNum w:abstractNumId="4" w15:restartNumberingAfterBreak="0">
+  <w:abstractNum w:abstractNumId="5" w15:restartNumberingAfterBreak="0">
     <w:nsid w:val="3A0C0B8C"/>
     <w:multiLevelType w:val="multilevel"/>
     <w:tmpl w:val="4CB8974E"/>
@@ -2302,7 +2729,7 @@
       </w:rPr>
     </w:lvl>
   </w:abstractNum>
-  <w:abstractNum w:abstractNumId="5" w15:restartNumberingAfterBreak="0">
+  <w:abstractNum w:abstractNumId="6" w15:restartNumberingAfterBreak="0">
     <w:nsid w:val="3A8C5D82"/>
     <w:multiLevelType w:val="multilevel"/>
     <w:tmpl w:val="171AC26E"/>
@@ -2415,7 +2842,7 @@
       </w:pPr>
     </w:lvl>
   </w:abstractNum>
-  <w:abstractNum w:abstractNumId="6" w15:restartNumberingAfterBreak="0">
+  <w:abstractNum w:abstractNumId="7" w15:restartNumberingAfterBreak="0">
     <w:nsid w:val="3C746383"/>
     <w:multiLevelType w:val="multilevel"/>
     <w:tmpl w:val="A9B6401E"/>
@@ -2564,7 +2991,7 @@
       </w:rPr>
     </w:lvl>
   </w:abstractNum>
-  <w:abstractNum w:abstractNumId="7" w15:restartNumberingAfterBreak="0">
+  <w:abstractNum w:abstractNumId="8" w15:restartNumberingAfterBreak="0">
     <w:nsid w:val="3C787A28"/>
     <w:multiLevelType w:val="multilevel"/>
     <w:tmpl w:val="90BABE3C"/>
@@ -2709,7 +3136,124 @@
       </w:rPr>
     </w:lvl>
   </w:abstractNum>
-  <w:abstractNum w:abstractNumId="8" w15:restartNumberingAfterBreak="0">
+  <w:abstractNum w:abstractNumId="9" w15:restartNumberingAfterBreak="0">
+    <w:nsid w:val="47787782"/>
+    <w:multiLevelType w:val="multilevel"/>
+    <w:tmpl w:val="ED22E720"/>
+    <w:lvl w:ilvl="0">
+      <w:start w:val="1"/>
+      <w:numFmt w:val="decimal"/>
+      <w:lvlText w:val="%1."/>
+      <w:lvlJc w:val="left"/>
+      <w:pPr>
+        <w:tabs>
+          <w:tab w:val="num" w:pos="720"/>
+        </w:tabs>
+        <w:ind w:left="720" w:hanging="360"/>
+      </w:pPr>
+    </w:lvl>
+    <w:lvl w:ilvl="1">
+      <w:start w:val="1"/>
+      <w:numFmt w:val="bullet"/>
+      <w:lvlText w:val="o"/>
+      <w:lvlJc w:val="left"/>
+      <w:pPr>
+        <w:tabs>
+          <w:tab w:val="num" w:pos="1440"/>
+        </w:tabs>
+        <w:ind w:left="1440" w:hanging="360"/>
+      </w:pPr>
+      <w:rPr>
+        <w:rFonts w:ascii="Courier New" w:hAnsi="Courier New" w:hint="default"/>
+        <w:sz w:val="20"/>
+      </w:rPr>
+    </w:lvl>
+    <w:lvl w:ilvl="2" w:tentative="1">
+      <w:start w:val="1"/>
+      <w:numFmt w:val="decimal"/>
+      <w:lvlText w:val="%3."/>
+      <w:lvlJc w:val="left"/>
+      <w:pPr>
+        <w:tabs>
+          <w:tab w:val="num" w:pos="2160"/>
+        </w:tabs>
+        <w:ind w:left="2160" w:hanging="360"/>
+      </w:pPr>
+    </w:lvl>
+    <w:lvl w:ilvl="3" w:tentative="1">
+      <w:start w:val="1"/>
+      <w:numFmt w:val="decimal"/>
+      <w:lvlText w:val="%4."/>
+      <w:lvlJc w:val="left"/>
+      <w:pPr>
+        <w:tabs>
+          <w:tab w:val="num" w:pos="2880"/>
+        </w:tabs>
+        <w:ind w:left="2880" w:hanging="360"/>
+      </w:pPr>
+    </w:lvl>
+    <w:lvl w:ilvl="4" w:tentative="1">
+      <w:start w:val="1"/>
+      <w:numFmt w:val="decimal"/>
+      <w:lvlText w:val="%5."/>
+      <w:lvlJc w:val="left"/>
+      <w:pPr>
+        <w:tabs>
+          <w:tab w:val="num" w:pos="3600"/>
+        </w:tabs>
+        <w:ind w:left="3600" w:hanging="360"/>
+      </w:pPr>
+    </w:lvl>
+    <w:lvl w:ilvl="5" w:tentative="1">
+      <w:start w:val="1"/>
+      <w:numFmt w:val="decimal"/>
+      <w:lvlText w:val="%6."/>
+      <w:lvlJc w:val="left"/>
+      <w:pPr>
+        <w:tabs>
+          <w:tab w:val="num" w:pos="4320"/>
+        </w:tabs>
+        <w:ind w:left="4320" w:hanging="360"/>
+      </w:pPr>
+    </w:lvl>
+    <w:lvl w:ilvl="6" w:tentative="1">
+      <w:start w:val="1"/>
+      <w:numFmt w:val="decimal"/>
+      <w:lvlText w:val="%7."/>
+      <w:lvlJc w:val="left"/>
+      <w:pPr>
+        <w:tabs>
+          <w:tab w:val="num" w:pos="5040"/>
+        </w:tabs>
+        <w:ind w:left="5040" w:hanging="360"/>
+      </w:pPr>
+    </w:lvl>
+    <w:lvl w:ilvl="7" w:tentative="1">
+      <w:start w:val="1"/>
+      <w:numFmt w:val="decimal"/>
+      <w:lvlText w:val="%8."/>
+      <w:lvlJc w:val="left"/>
+      <w:pPr>
+        <w:tabs>
+          <w:tab w:val="num" w:pos="5760"/>
+        </w:tabs>
+        <w:ind w:left="5760" w:hanging="360"/>
+      </w:pPr>
+    </w:lvl>
+    <w:lvl w:ilvl="8" w:tentative="1">
+      <w:start w:val="1"/>
+      <w:numFmt w:val="decimal"/>
+      <w:lvlText w:val="%9."/>
+      <w:lvlJc w:val="left"/>
+      <w:pPr>
+        <w:tabs>
+          <w:tab w:val="num" w:pos="6480"/>
+        </w:tabs>
+        <w:ind w:left="6480" w:hanging="360"/>
+      </w:pPr>
+    </w:lvl>
+  </w:abstractNum>
+  <w:abstractNum w:abstractNumId="10" w15:restartNumberingAfterBreak="0">
     <w:nsid w:val="52BF42F8"/>
     <w:multiLevelType w:val="multilevel"/>
     <w:tmpl w:val="DC2881EC"/>
@@ -2858,7 +3402,7 @@
       </w:rPr>
     </w:lvl>
   </w:abstractNum>
-  <w:abstractNum w:abstractNumId="9" w15:restartNumberingAfterBreak="0">
+  <w:abstractNum w:abstractNumId="11" w15:restartNumberingAfterBreak="0">
     <w:nsid w:val="52D5699A"/>
     <w:multiLevelType w:val="multilevel"/>
     <w:tmpl w:val="21726F3A"/>
@@ -3003,7 +3547,7 @@
       </w:rPr>
     </w:lvl>
   </w:abstractNum>
-  <w:abstractNum w:abstractNumId="10" w15:restartNumberingAfterBreak="0">
+  <w:abstractNum w:abstractNumId="12" w15:restartNumberingAfterBreak="0">
     <w:nsid w:val="57977298"/>
     <w:multiLevelType w:val="multilevel"/>
     <w:tmpl w:val="1D440E48"/>
@@ -3152,7 +3696,7 @@
       </w:rPr>
     </w:lvl>
   </w:abstractNum>
-  <w:abstractNum w:abstractNumId="11" w15:restartNumberingAfterBreak="0">
+  <w:abstractNum w:abstractNumId="13" w15:restartNumberingAfterBreak="0">
     <w:nsid w:val="65DE4FCB"/>
     <w:multiLevelType w:val="multilevel"/>
     <w:tmpl w:val="C13CCADC"/>
@@ -3301,7 +3845,7 @@
       </w:rPr>
     </w:lvl>
   </w:abstractNum>
-  <w:abstractNum w:abstractNumId="12" w15:restartNumberingAfterBreak="0">
+  <w:abstractNum w:abstractNumId="14" w15:restartNumberingAfterBreak="0">
     <w:nsid w:val="74CF7EE5"/>
     <w:multiLevelType w:val="hybridMultilevel"/>
     <w:tmpl w:val="CD4C69FC"/>
@@ -3414,7 +3958,7 @@
       </w:rPr>
     </w:lvl>
   </w:abstractNum>
-  <w:abstractNum w:abstractNumId="13" w15:restartNumberingAfterBreak="0">
+  <w:abstractNum w:abstractNumId="15" w15:restartNumberingAfterBreak="0">
     <w:nsid w:val="796F6C13"/>
     <w:multiLevelType w:val="multilevel"/>
     <w:tmpl w:val="69BE2792"/>
@@ -3560,7 +4104,7 @@
     </w:lvl>
   </w:abstractNum>
   <w:num w:numId="1" w16cid:durableId="253167005">
-    <w:abstractNumId w:val="4"/>
+    <w:abstractNumId w:val="5"/>
   </w:num>
   <w:num w:numId="2" w16cid:durableId="1333264693">
     <w:abstractNumId w:val="1"/>
@@ -3569,37 +4113,43 @@
     <w:abstractNumId w:val="0"/>
   </w:num>
   <w:num w:numId="4" w16cid:durableId="1407024986">
-    <w:abstractNumId w:val="8"/>
+    <w:abstractNumId w:val="10"/>
   </w:num>
   <w:num w:numId="5" w16cid:durableId="59981819">
-    <w:abstractNumId w:val="11"/>
+    <w:abstractNumId w:val="13"/>
   </w:num>
   <w:num w:numId="6" w16cid:durableId="2065372102">
-    <w:abstractNumId w:val="3"/>
+    <w:abstractNumId w:val="4"/>
   </w:num>
   <w:num w:numId="7" w16cid:durableId="126440358">
+    <w:abstractNumId w:val="7"/>
+  </w:num>
+  <w:num w:numId="8" w16cid:durableId="664936200">
+    <w:abstractNumId w:val="12"/>
+  </w:num>
+  <w:num w:numId="9" w16cid:durableId="916521461">
     <w:abstractNumId w:val="6"/>
   </w:num>
-  <w:num w:numId="8" w16cid:durableId="664936200">
-    <w:abstractNumId w:val="10"/>
-  </w:num>
-  <w:num w:numId="9" w16cid:durableId="916521461">
-    <w:abstractNumId w:val="5"/>
-  </w:num>
   <w:num w:numId="10" w16cid:durableId="664936579">
-    <w:abstractNumId w:val="12"/>
+    <w:abstractNumId w:val="14"/>
   </w:num>
   <w:num w:numId="11" w16cid:durableId="150484103">
     <w:abstractNumId w:val="2"/>
   </w:num>
   <w:num w:numId="12" w16cid:durableId="1404641219">
-    <w:abstractNumId w:val="13"/>
+    <w:abstractNumId w:val="15"/>
   </w:num>
   <w:num w:numId="13" w16cid:durableId="137116789">
+    <w:abstractNumId w:val="11"/>
+  </w:num>
+  <w:num w:numId="14" w16cid:durableId="692419437">
+    <w:abstractNumId w:val="8"/>
+  </w:num>
+  <w:num w:numId="15" w16cid:durableId="893547156">
     <w:abstractNumId w:val="9"/>
   </w:num>
-  <w:num w:numId="14" w16cid:durableId="692419437">
-    <w:abstractNumId w:val="7"/>
+  <w:num w:numId="16" w16cid:durableId="349334655">
+    <w:abstractNumId w:val="3"/>
   </w:num>
 </w:numbering>
 </file>
@@ -4540,6 +5090,32 @@
       </w:tblBorders>
     </w:tblPr>
   </w:style>
+  <w:style w:type="paragraph" w:styleId="NormalWeb">
+    <w:name w:val="Normal (Web)"/>
+    <w:basedOn w:val="Normal"/>
+    <w:uiPriority w:val="99"/>
+    <w:unhideWhenUsed/>
+    <w:rsid w:val="006C0F09"/>
+    <w:pPr>
+      <w:spacing w:before="100" w:beforeAutospacing="1" w:after="100" w:afterAutospacing="1" w:line="240" w:lineRule="auto"/>
+    </w:pPr>
+    <w:rPr>
+      <w:rFonts w:ascii="Times New Roman" w:eastAsia="Times New Roman" w:hAnsi="Times New Roman" w:cs="Times New Roman"/>
+      <w:kern w:val="0"/>
+      <w14:ligatures w14:val="none"/>
+    </w:rPr>
+  </w:style>
+  <w:style w:type="character" w:styleId="Strong">
+    <w:name w:val="Strong"/>
+    <w:basedOn w:val="DefaultParagraphFont"/>
+    <w:uiPriority w:val="22"/>
+    <w:qFormat/>
+    <w:rsid w:val="006C0F09"/>
+    <w:rPr>
+      <w:b/>
+      <w:bCs/>
+    </w:rPr>
+  </w:style>
 </w:styles>
 </file>
 

</xml_diff>